<commit_message>
docs(ocpi): v1.1 — add §5.13 AION Vendor Extension
Documents the 5 new /ocpi/2.2.1/aion/* endpoints (lights, display,
credentials, schedule, lock) shipped in this release. Each sub-section
includes the request body, cURL example, and expected response envelope.

Also refreshes the contact block (single project lead email) and adds
a v1.1 row to the change log.

Co-Authored-By: Claude Opus 4.7 <noreply@anthropic.com>
</commit_message>
<xml_diff>
--- a/ChargingPlatform/docs/CZERO_OCPI_API_v1.0.docx
+++ b/ChargingPlatform/docs/CZERO_OCPI_API_v1.0.docx
@@ -3574,6 +3574,2855 @@
           <w:color w:val="0B4EA2"/>
           <w:sz w:val="44"/>
         </w:rPr>
+        <w:t>5.13 AION Vendor Extension</w:t>
+      </w:r>
+    </w:p>
+    <w:p>
+      <w:r>
+        <w:t xml:space="preserve">Non-standard modules mounted under the OCPI namespace at </w:t>
+      </w:r>
+      <w:r>
+        <w:rPr>
+          <w:rFonts w:ascii="Consolas" w:hAnsi="Consolas"/>
+          <w:sz w:val="19"/>
+        </w:rPr>
+        <w:t>/ocpi/2.2.1/aion/*</w:t>
+      </w:r>
+      <w:r>
+        <w:t>. These expose AION-specific charger controls that are not part of the OCPI 2.2.1 specification but are required for fleet operators managing the AION E7-A hardware family.</w:t>
+      </w:r>
+    </w:p>
+    <w:p>
+      <w:r>
+        <w:rPr>
+          <w:b/>
+        </w:rPr>
+        <w:t>Firmware requirement:</w:t>
+      </w:r>
+      <w:r>
+        <w:t xml:space="preserve"> </w:t>
+      </w:r>
+      <w:r>
+        <w:rPr>
+          <w:rFonts w:ascii="Consolas" w:hAnsi="Consolas"/>
+          <w:sz w:val="19"/>
+        </w:rPr>
+        <w:t>TK-AMC003-LCD_V2.0.04</w:t>
+      </w:r>
+      <w:r>
+        <w:t xml:space="preserve"> or later.</w:t>
+      </w:r>
+    </w:p>
+    <w:p>
+      <w:r>
+        <w:rPr>
+          <w:b/>
+        </w:rPr>
+        <w:t>Authentication:</w:t>
+      </w:r>
+      <w:r>
+        <w:t xml:space="preserve"> same </w:t>
+      </w:r>
+      <w:r>
+        <w:rPr>
+          <w:rFonts w:ascii="Consolas" w:hAnsi="Consolas"/>
+          <w:sz w:val="19"/>
+        </w:rPr>
+        <w:t>Authorization: Token …</w:t>
+      </w:r>
+      <w:r>
+        <w:t xml:space="preserve"> header used across all OCPI endpoints.</w:t>
+      </w:r>
+    </w:p>
+    <w:p>
+      <w:r>
+        <w:rPr>
+          <w:b/>
+        </w:rPr>
+        <w:t>Response envelope:</w:t>
+      </w:r>
+      <w:r>
+        <w:t xml:space="preserve"> identical to standard OCPI (§4).</w:t>
+      </w:r>
+    </w:p>
+    <w:p>
+      <w:r>
+        <w:rPr>
+          <w:b/>
+        </w:rPr>
+        <w:t>Common request pattern:</w:t>
+      </w:r>
+      <w:r>
+        <w:t xml:space="preserve"> </w:t>
+      </w:r>
+      <w:r>
+        <w:rPr>
+          <w:rFonts w:ascii="Consolas" w:hAnsi="Consolas"/>
+          <w:sz w:val="19"/>
+        </w:rPr>
+        <w:t>POST</w:t>
+      </w:r>
+      <w:r>
+        <w:t xml:space="preserve"> endpoints only apply fields that are supplied — omit a field to leave it unchanged. All </w:t>
+      </w:r>
+      <w:r>
+        <w:rPr>
+          <w:rFonts w:ascii="Consolas" w:hAnsi="Consolas"/>
+          <w:sz w:val="19"/>
+        </w:rPr>
+        <w:t>POST</w:t>
+      </w:r>
+      <w:r>
+        <w:t xml:space="preserve"> endpoints return </w:t>
+      </w:r>
+      <w:r>
+        <w:rPr>
+          <w:rFonts w:ascii="Consolas" w:hAnsi="Consolas"/>
+          <w:sz w:val="19"/>
+        </w:rPr>
+        <w:t>applied: [&lt;keys changed&gt;]</w:t>
+      </w:r>
+      <w:r>
+        <w:t xml:space="preserve"> so the caller can audit what was actually written to the charger.</w:t>
+      </w:r>
+    </w:p>
+    <w:p>
+      <w:r>
+        <w:rPr>
+          <w:b/>
+        </w:rPr>
+        <w:t>Common error responses:</w:t>
+      </w:r>
+    </w:p>
+    <w:tbl>
+      <w:tblPr>
+        <w:tblStyle w:val="LightGrid-Accent1"/>
+        <w:tblW w:type="auto" w:w="0"/>
+        <w:tblLayout w:type="autofit"/>
+        <w:tblLook w:firstColumn="1" w:firstRow="1" w:lastColumn="0" w:lastRow="0" w:noHBand="0" w:noVBand="1" w:val="04A0"/>
+      </w:tblPr>
+      <w:tblGrid>
+        <w:gridCol w:w="4819"/>
+        <w:gridCol w:w="4819"/>
+      </w:tblGrid>
+      <w:tr>
+        <w:tc>
+          <w:tcPr>
+            <w:tcW w:type="dxa" w:w="4819"/>
+            <w:vAlign w:val="top"/>
+            <w:shd w:val="clear" w:color="auto" w:fill="0B4EA2"/>
+          </w:tcPr>
+          <w:p>
+            <w:r/>
+            <w:r>
+              <w:rPr>
+                <w:b/>
+                <w:color w:val="FFFFFF"/>
+                <w:sz w:val="19"/>
+              </w:rPr>
+              <w:t>HTTP</w:t>
+            </w:r>
+          </w:p>
+        </w:tc>
+        <w:tc>
+          <w:tcPr>
+            <w:tcW w:type="dxa" w:w="4819"/>
+            <w:vAlign w:val="top"/>
+            <w:shd w:val="clear" w:color="auto" w:fill="0B4EA2"/>
+          </w:tcPr>
+          <w:p>
+            <w:r/>
+            <w:r>
+              <w:rPr>
+                <w:b/>
+                <w:color w:val="FFFFFF"/>
+                <w:sz w:val="19"/>
+              </w:rPr>
+              <w:t>Meaning</w:t>
+            </w:r>
+          </w:p>
+        </w:tc>
+      </w:tr>
+      <w:tr>
+        <w:tc>
+          <w:tcPr>
+            <w:tcW w:type="dxa" w:w="4819"/>
+            <w:vAlign w:val="top"/>
+          </w:tcPr>
+          <w:p>
+            <w:r/>
+            <w:r>
+              <w:rPr>
+                <w:sz w:val="19"/>
+              </w:rPr>
+              <w:t>400</w:t>
+            </w:r>
+          </w:p>
+        </w:tc>
+        <w:tc>
+          <w:tcPr>
+            <w:tcW w:type="dxa" w:w="4819"/>
+            <w:vAlign w:val="top"/>
+          </w:tcPr>
+          <w:p>
+            <w:r/>
+            <w:r>
+              <w:rPr>
+                <w:sz w:val="19"/>
+              </w:rPr>
+              <w:t>No field supplied in POST body</w:t>
+            </w:r>
+          </w:p>
+        </w:tc>
+      </w:tr>
+      <w:tr>
+        <w:tc>
+          <w:tcPr>
+            <w:tcW w:type="dxa" w:w="4819"/>
+            <w:vAlign w:val="top"/>
+            <w:shd w:val="clear" w:color="auto" w:fill="F2F5FA"/>
+          </w:tcPr>
+          <w:p>
+            <w:r/>
+            <w:r>
+              <w:rPr>
+                <w:sz w:val="19"/>
+              </w:rPr>
+              <w:t>403</w:t>
+            </w:r>
+          </w:p>
+        </w:tc>
+        <w:tc>
+          <w:tcPr>
+            <w:tcW w:type="dxa" w:w="4819"/>
+            <w:vAlign w:val="top"/>
+            <w:shd w:val="clear" w:color="auto" w:fill="F2F5FA"/>
+          </w:tcPr>
+          <w:p>
+            <w:r/>
+            <w:r>
+              <w:rPr>
+                <w:sz w:val="19"/>
+              </w:rPr>
+              <w:t>Missing / invalid OCPI token</w:t>
+            </w:r>
+          </w:p>
+        </w:tc>
+      </w:tr>
+      <w:tr>
+        <w:tc>
+          <w:tcPr>
+            <w:tcW w:type="dxa" w:w="4819"/>
+            <w:vAlign w:val="top"/>
+          </w:tcPr>
+          <w:p>
+            <w:r/>
+            <w:r>
+              <w:rPr>
+                <w:sz w:val="19"/>
+              </w:rPr>
+              <w:t>404</w:t>
+            </w:r>
+          </w:p>
+        </w:tc>
+        <w:tc>
+          <w:tcPr>
+            <w:tcW w:type="dxa" w:w="4819"/>
+            <w:vAlign w:val="top"/>
+          </w:tcPr>
+          <w:p>
+            <w:r/>
+            <w:r>
+              <w:rPr>
+                <w:sz w:val="19"/>
+              </w:rPr>
+              <w:t>Unknown charger_id</w:t>
+            </w:r>
+          </w:p>
+        </w:tc>
+      </w:tr>
+      <w:tr>
+        <w:tc>
+          <w:tcPr>
+            <w:tcW w:type="dxa" w:w="4819"/>
+            <w:vAlign w:val="top"/>
+            <w:shd w:val="clear" w:color="auto" w:fill="F2F5FA"/>
+          </w:tcPr>
+          <w:p>
+            <w:r/>
+            <w:r>
+              <w:rPr>
+                <w:sz w:val="19"/>
+              </w:rPr>
+              <w:t>502</w:t>
+            </w:r>
+          </w:p>
+        </w:tc>
+        <w:tc>
+          <w:tcPr>
+            <w:tcW w:type="dxa" w:w="4819"/>
+            <w:vAlign w:val="top"/>
+            <w:shd w:val="clear" w:color="auto" w:fill="F2F5FA"/>
+          </w:tcPr>
+          <w:p>
+            <w:r/>
+            <w:r>
+              <w:rPr>
+                <w:sz w:val="19"/>
+              </w:rPr>
+              <w:t>Charger rejected the OCPP command (returned Rejected or NotSupported)</w:t>
+            </w:r>
+          </w:p>
+        </w:tc>
+      </w:tr>
+      <w:tr>
+        <w:tc>
+          <w:tcPr>
+            <w:tcW w:type="dxa" w:w="4819"/>
+            <w:vAlign w:val="top"/>
+          </w:tcPr>
+          <w:p>
+            <w:r/>
+            <w:r>
+              <w:rPr>
+                <w:sz w:val="19"/>
+              </w:rPr>
+              <w:t>503</w:t>
+            </w:r>
+          </w:p>
+        </w:tc>
+        <w:tc>
+          <w:tcPr>
+            <w:tcW w:type="dxa" w:w="4819"/>
+            <w:vAlign w:val="top"/>
+          </w:tcPr>
+          <w:p>
+            <w:r/>
+            <w:r>
+              <w:rPr>
+                <w:sz w:val="19"/>
+              </w:rPr>
+              <w:t>Charger's OCPP WebSocket is not currently connected</w:t>
+            </w:r>
+          </w:p>
+        </w:tc>
+      </w:tr>
+    </w:tbl>
+    <w:p/>
+    <w:p>
+      <w:pPr>
+        <w:pBdr>
+          <w:bottom w:val="single" w:sz="8" w:color="0B4EA2"/>
+        </w:pBdr>
+      </w:pPr>
+    </w:p>
+    <w:p>
+      <w:pPr>
+        <w:spacing w:before="200" w:after="120"/>
+      </w:pPr>
+      <w:r>
+        <w:rPr>
+          <w:b/>
+          <w:color w:val="0B4EA2"/>
+          <w:sz w:val="32"/>
+        </w:rPr>
+        <w:t>5.13.1 Lights — Front-panel LEDs</w:t>
+      </w:r>
+    </w:p>
+    <w:p>
+      <w:r>
+        <w:t>Toggle the three AION front-housing LEDs individually.</w:t>
+      </w:r>
+    </w:p>
+    <w:p>
+      <w:pPr>
+        <w:spacing w:before="200" w:after="120"/>
+      </w:pPr>
+      <w:r>
+        <w:rPr>
+          <w:b/>
+          <w:color w:val="1A1A1A"/>
+          <w:sz w:val="26"/>
+        </w:rPr>
+        <w:t>`POST /ocpi/2.2.1/aion/lights`</w:t>
+      </w:r>
+    </w:p>
+    <w:p>
+      <w:r>
+        <w:rPr>
+          <w:b/>
+        </w:rPr>
+        <w:t>Request body</w:t>
+      </w:r>
+    </w:p>
+    <w:tbl>
+      <w:tblPr>
+        <w:tblStyle w:val="LightGrid-Accent1"/>
+        <w:tblW w:type="auto" w:w="0"/>
+        <w:tblLayout w:type="autofit"/>
+        <w:tblLook w:firstColumn="1" w:firstRow="1" w:lastColumn="0" w:lastRow="0" w:noHBand="0" w:noVBand="1" w:val="04A0"/>
+      </w:tblPr>
+      <w:tblGrid>
+        <w:gridCol w:w="2409"/>
+        <w:gridCol w:w="2409"/>
+        <w:gridCol w:w="2409"/>
+        <w:gridCol w:w="2409"/>
+      </w:tblGrid>
+      <w:tr>
+        <w:tc>
+          <w:tcPr>
+            <w:tcW w:type="dxa" w:w="2409"/>
+            <w:vAlign w:val="top"/>
+            <w:shd w:val="clear" w:color="auto" w:fill="0B4EA2"/>
+          </w:tcPr>
+          <w:p>
+            <w:r/>
+            <w:r>
+              <w:rPr>
+                <w:b/>
+                <w:color w:val="FFFFFF"/>
+                <w:sz w:val="19"/>
+              </w:rPr>
+              <w:t>Field</w:t>
+            </w:r>
+          </w:p>
+        </w:tc>
+        <w:tc>
+          <w:tcPr>
+            <w:tcW w:type="dxa" w:w="2409"/>
+            <w:vAlign w:val="top"/>
+            <w:shd w:val="clear" w:color="auto" w:fill="0B4EA2"/>
+          </w:tcPr>
+          <w:p>
+            <w:r/>
+            <w:r>
+              <w:rPr>
+                <w:b/>
+                <w:color w:val="FFFFFF"/>
+                <w:sz w:val="19"/>
+              </w:rPr>
+              <w:t>Type</w:t>
+            </w:r>
+          </w:p>
+        </w:tc>
+        <w:tc>
+          <w:tcPr>
+            <w:tcW w:type="dxa" w:w="2409"/>
+            <w:vAlign w:val="top"/>
+            <w:shd w:val="clear" w:color="auto" w:fill="0B4EA2"/>
+          </w:tcPr>
+          <w:p>
+            <w:r/>
+            <w:r>
+              <w:rPr>
+                <w:b/>
+                <w:color w:val="FFFFFF"/>
+                <w:sz w:val="19"/>
+              </w:rPr>
+              <w:t>Required</w:t>
+            </w:r>
+          </w:p>
+        </w:tc>
+        <w:tc>
+          <w:tcPr>
+            <w:tcW w:type="dxa" w:w="2409"/>
+            <w:vAlign w:val="top"/>
+            <w:shd w:val="clear" w:color="auto" w:fill="0B4EA2"/>
+          </w:tcPr>
+          <w:p>
+            <w:r/>
+            <w:r>
+              <w:rPr>
+                <w:b/>
+                <w:color w:val="FFFFFF"/>
+                <w:sz w:val="19"/>
+              </w:rPr>
+              <w:t>Description</w:t>
+            </w:r>
+          </w:p>
+        </w:tc>
+      </w:tr>
+      <w:tr>
+        <w:tc>
+          <w:tcPr>
+            <w:tcW w:type="dxa" w:w="2409"/>
+            <w:vAlign w:val="top"/>
+          </w:tcPr>
+          <w:p>
+            <w:r/>
+            <w:r>
+              <w:rPr>
+                <w:sz w:val="19"/>
+              </w:rPr>
+              <w:t>charger_id</w:t>
+            </w:r>
+          </w:p>
+        </w:tc>
+        <w:tc>
+          <w:tcPr>
+            <w:tcW w:type="dxa" w:w="2409"/>
+            <w:vAlign w:val="top"/>
+          </w:tcPr>
+          <w:p>
+            <w:r/>
+            <w:r>
+              <w:rPr>
+                <w:sz w:val="19"/>
+              </w:rPr>
+              <w:t>string</w:t>
+            </w:r>
+          </w:p>
+        </w:tc>
+        <w:tc>
+          <w:tcPr>
+            <w:tcW w:type="dxa" w:w="2409"/>
+            <w:vAlign w:val="top"/>
+          </w:tcPr>
+          <w:p>
+            <w:r/>
+            <w:r>
+              <w:rPr>
+                <w:sz w:val="19"/>
+              </w:rPr>
+              <w:t>Yes</w:t>
+            </w:r>
+          </w:p>
+        </w:tc>
+        <w:tc>
+          <w:tcPr>
+            <w:tcW w:type="dxa" w:w="2409"/>
+            <w:vAlign w:val="top"/>
+          </w:tcPr>
+          <w:p>
+            <w:r/>
+            <w:r>
+              <w:rPr>
+                <w:sz w:val="19"/>
+              </w:rPr>
+              <w:t>Physical charger ID</w:t>
+            </w:r>
+          </w:p>
+        </w:tc>
+      </w:tr>
+      <w:tr>
+        <w:tc>
+          <w:tcPr>
+            <w:tcW w:type="dxa" w:w="2409"/>
+            <w:vAlign w:val="top"/>
+            <w:shd w:val="clear" w:color="auto" w:fill="F2F5FA"/>
+          </w:tcPr>
+          <w:p>
+            <w:r/>
+            <w:r>
+              <w:rPr>
+                <w:sz w:val="19"/>
+              </w:rPr>
+              <w:t>status_light</w:t>
+            </w:r>
+          </w:p>
+        </w:tc>
+        <w:tc>
+          <w:tcPr>
+            <w:tcW w:type="dxa" w:w="2409"/>
+            <w:vAlign w:val="top"/>
+            <w:shd w:val="clear" w:color="auto" w:fill="F2F5FA"/>
+          </w:tcPr>
+          <w:p>
+            <w:r/>
+            <w:r>
+              <w:rPr>
+                <w:sz w:val="19"/>
+              </w:rPr>
+              <w:t>boolean</w:t>
+            </w:r>
+          </w:p>
+        </w:tc>
+        <w:tc>
+          <w:tcPr>
+            <w:tcW w:type="dxa" w:w="2409"/>
+            <w:vAlign w:val="top"/>
+            <w:shd w:val="clear" w:color="auto" w:fill="F2F5FA"/>
+          </w:tcPr>
+          <w:p>
+            <w:r/>
+            <w:r>
+              <w:rPr>
+                <w:sz w:val="19"/>
+              </w:rPr>
+              <w:t>No</w:t>
+            </w:r>
+          </w:p>
+        </w:tc>
+        <w:tc>
+          <w:tcPr>
+            <w:tcW w:type="dxa" w:w="2409"/>
+            <w:vAlign w:val="top"/>
+            <w:shd w:val="clear" w:color="auto" w:fill="F2F5FA"/>
+          </w:tcPr>
+          <w:p>
+            <w:r/>
+            <w:r>
+              <w:rPr>
+                <w:sz w:val="19"/>
+              </w:rPr>
+              <w:t>Status ring LED on/off</w:t>
+            </w:r>
+          </w:p>
+        </w:tc>
+      </w:tr>
+      <w:tr>
+        <w:tc>
+          <w:tcPr>
+            <w:tcW w:type="dxa" w:w="2409"/>
+            <w:vAlign w:val="top"/>
+          </w:tcPr>
+          <w:p>
+            <w:r/>
+            <w:r>
+              <w:rPr>
+                <w:sz w:val="19"/>
+              </w:rPr>
+              <w:t>logo_light</w:t>
+            </w:r>
+          </w:p>
+        </w:tc>
+        <w:tc>
+          <w:tcPr>
+            <w:tcW w:type="dxa" w:w="2409"/>
+            <w:vAlign w:val="top"/>
+          </w:tcPr>
+          <w:p>
+            <w:r/>
+            <w:r>
+              <w:rPr>
+                <w:sz w:val="19"/>
+              </w:rPr>
+              <w:t>boolean</w:t>
+            </w:r>
+          </w:p>
+        </w:tc>
+        <w:tc>
+          <w:tcPr>
+            <w:tcW w:type="dxa" w:w="2409"/>
+            <w:vAlign w:val="top"/>
+          </w:tcPr>
+          <w:p>
+            <w:r/>
+            <w:r>
+              <w:rPr>
+                <w:sz w:val="19"/>
+              </w:rPr>
+              <w:t>No</w:t>
+            </w:r>
+          </w:p>
+        </w:tc>
+        <w:tc>
+          <w:tcPr>
+            <w:tcW w:type="dxa" w:w="2409"/>
+            <w:vAlign w:val="top"/>
+          </w:tcPr>
+          <w:p>
+            <w:r/>
+            <w:r>
+              <w:rPr>
+                <w:sz w:val="19"/>
+              </w:rPr>
+              <w:t>Logo backlight LED on/off</w:t>
+            </w:r>
+          </w:p>
+        </w:tc>
+      </w:tr>
+      <w:tr>
+        <w:tc>
+          <w:tcPr>
+            <w:tcW w:type="dxa" w:w="2409"/>
+            <w:vAlign w:val="top"/>
+            <w:shd w:val="clear" w:color="auto" w:fill="F2F5FA"/>
+          </w:tcPr>
+          <w:p>
+            <w:r/>
+            <w:r>
+              <w:rPr>
+                <w:sz w:val="19"/>
+              </w:rPr>
+              <w:t>background_light</w:t>
+            </w:r>
+          </w:p>
+        </w:tc>
+        <w:tc>
+          <w:tcPr>
+            <w:tcW w:type="dxa" w:w="2409"/>
+            <w:vAlign w:val="top"/>
+            <w:shd w:val="clear" w:color="auto" w:fill="F2F5FA"/>
+          </w:tcPr>
+          <w:p>
+            <w:r/>
+            <w:r>
+              <w:rPr>
+                <w:sz w:val="19"/>
+              </w:rPr>
+              <w:t>boolean</w:t>
+            </w:r>
+          </w:p>
+        </w:tc>
+        <w:tc>
+          <w:tcPr>
+            <w:tcW w:type="dxa" w:w="2409"/>
+            <w:vAlign w:val="top"/>
+            <w:shd w:val="clear" w:color="auto" w:fill="F2F5FA"/>
+          </w:tcPr>
+          <w:p>
+            <w:r/>
+            <w:r>
+              <w:rPr>
+                <w:sz w:val="19"/>
+              </w:rPr>
+              <w:t>No</w:t>
+            </w:r>
+          </w:p>
+        </w:tc>
+        <w:tc>
+          <w:tcPr>
+            <w:tcW w:type="dxa" w:w="2409"/>
+            <w:vAlign w:val="top"/>
+            <w:shd w:val="clear" w:color="auto" w:fill="F2F5FA"/>
+          </w:tcPr>
+          <w:p>
+            <w:r/>
+            <w:r>
+              <w:rPr>
+                <w:sz w:val="19"/>
+              </w:rPr>
+              <w:t>Background accent LED on/off</w:t>
+            </w:r>
+          </w:p>
+        </w:tc>
+      </w:tr>
+    </w:tbl>
+    <w:p/>
+    <w:p>
+      <w:r>
+        <w:rPr>
+          <w:b/>
+        </w:rPr>
+        <w:t>Example</w:t>
+      </w:r>
+    </w:p>
+    <w:p>
+      <w:pPr>
+        <w:spacing w:before="80" w:after="160"/>
+        <w:ind w:left="283"/>
+        <w:shd w:val="clear" w:color="auto" w:fill="F4F4F4"/>
+      </w:pPr>
+      <w:r>
+        <w:rPr>
+          <w:rFonts w:ascii="Consolas" w:hAnsi="Consolas"/>
+          <w:sz w:val="18"/>
+        </w:rPr>
+        <w:t>curl -X POST https://charger.czeros.tech/ocpi/2.2.1/aion/lights \</w:t>
+        <w:br/>
+        <w:t xml:space="preserve">  -H "Authorization: Token $OCPI_TOKEN" \</w:t>
+        <w:br/>
+        <w:t xml:space="preserve">  -H "Content-Type: application/json" \</w:t>
+        <w:br/>
+        <w:t xml:space="preserve">  -d '{"charger_id":"0748911403000093","status_light":true,"logo_light":false}'</w:t>
+      </w:r>
+    </w:p>
+    <w:p>
+      <w:r>
+        <w:rPr>
+          <w:b/>
+        </w:rPr>
+        <w:t>Response 200</w:t>
+      </w:r>
+    </w:p>
+    <w:p>
+      <w:pPr>
+        <w:spacing w:before="80" w:after="160"/>
+        <w:ind w:left="283"/>
+        <w:shd w:val="clear" w:color="auto" w:fill="F4F4F4"/>
+      </w:pPr>
+      <w:r>
+        <w:rPr>
+          <w:rFonts w:ascii="Consolas" w:hAnsi="Consolas"/>
+          <w:sz w:val="18"/>
+        </w:rPr>
+        <w:t>{</w:t>
+        <w:br/>
+        <w:t xml:space="preserve">  "status_code": 1000,</w:t>
+        <w:br/>
+        <w:t xml:space="preserve">  "status_message": "Success",</w:t>
+        <w:br/>
+        <w:t xml:space="preserve">  "timestamp": "2026-07-15T03:09:38Z",</w:t>
+        <w:br/>
+        <w:t xml:space="preserve">  "data": {</w:t>
+        <w:br/>
+        <w:t xml:space="preserve">    "charger_id": "0748911403000093",</w:t>
+        <w:br/>
+        <w:t xml:space="preserve">    "applied": ["StatusLight", "LogoLight"]</w:t>
+        <w:br/>
+        <w:t xml:space="preserve">  }</w:t>
+        <w:br/>
+        <w:t>}</w:t>
+      </w:r>
+    </w:p>
+    <w:p>
+      <w:pPr>
+        <w:spacing w:before="200" w:after="120"/>
+      </w:pPr>
+      <w:r>
+        <w:rPr>
+          <w:b/>
+          <w:color w:val="1A1A1A"/>
+          <w:sz w:val="26"/>
+        </w:rPr>
+        <w:t>`GET /ocpi/2.2.1/aion/lights?charger_id={id}`</w:t>
+      </w:r>
+    </w:p>
+    <w:p>
+      <w:r>
+        <w:t xml:space="preserve">Returns current LED states. Response </w:t>
+      </w:r>
+      <w:r>
+        <w:rPr>
+          <w:rFonts w:ascii="Consolas" w:hAnsi="Consolas"/>
+          <w:sz w:val="19"/>
+        </w:rPr>
+        <w:t>data</w:t>
+      </w:r>
+      <w:r>
+        <w:t>:</w:t>
+      </w:r>
+    </w:p>
+    <w:p>
+      <w:pPr>
+        <w:spacing w:before="80" w:after="160"/>
+        <w:ind w:left="283"/>
+        <w:shd w:val="clear" w:color="auto" w:fill="F4F4F4"/>
+      </w:pPr>
+      <w:r>
+        <w:rPr>
+          <w:rFonts w:ascii="Consolas" w:hAnsi="Consolas"/>
+          <w:sz w:val="18"/>
+        </w:rPr>
+        <w:t>{</w:t>
+        <w:br/>
+        <w:t xml:space="preserve">  "charger_id": "0748911403000093",</w:t>
+        <w:br/>
+        <w:t xml:space="preserve">  "status_light": true,</w:t>
+        <w:br/>
+        <w:t xml:space="preserve">  "logo_light": true,</w:t>
+        <w:br/>
+        <w:t xml:space="preserve">  "background_light": true</w:t>
+        <w:br/>
+        <w:t>}</w:t>
+      </w:r>
+    </w:p>
+    <w:p>
+      <w:pPr>
+        <w:pBdr>
+          <w:bottom w:val="single" w:sz="8" w:color="0B4EA2"/>
+        </w:pBdr>
+      </w:pPr>
+    </w:p>
+    <w:p>
+      <w:pPr>
+        <w:spacing w:before="200" w:after="120"/>
+      </w:pPr>
+      <w:r>
+        <w:rPr>
+          <w:b/>
+          <w:color w:val="0B4EA2"/>
+          <w:sz w:val="32"/>
+        </w:rPr>
+        <w:t>5.13.2 Display — LCD text and wallpaper</w:t>
+      </w:r>
+    </w:p>
+    <w:p>
+      <w:r>
+        <w:t>The AION LCD shows a customisable header text (</w:t>
+      </w:r>
+      <w:r>
+        <w:rPr>
+          <w:rFonts w:ascii="Consolas" w:hAnsi="Consolas"/>
+          <w:sz w:val="19"/>
+        </w:rPr>
+        <w:t>home_number</w:t>
+      </w:r>
+      <w:r>
+        <w:t>) and a background wallpaper selected from a preset library (</w:t>
+      </w:r>
+      <w:r>
+        <w:rPr>
+          <w:rFonts w:ascii="Consolas" w:hAnsi="Consolas"/>
+          <w:sz w:val="19"/>
+        </w:rPr>
+        <w:t>background</w:t>
+      </w:r>
+      <w:r>
+        <w:t>).</w:t>
+      </w:r>
+    </w:p>
+    <w:p>
+      <w:pPr>
+        <w:spacing w:before="200" w:after="120"/>
+      </w:pPr>
+      <w:r>
+        <w:rPr>
+          <w:b/>
+          <w:color w:val="1A1A1A"/>
+          <w:sz w:val="26"/>
+        </w:rPr>
+        <w:t>`POST /ocpi/2.2.1/aion/display`</w:t>
+      </w:r>
+    </w:p>
+    <w:p>
+      <w:r>
+        <w:rPr>
+          <w:b/>
+        </w:rPr>
+        <w:t>Request body</w:t>
+      </w:r>
+    </w:p>
+    <w:tbl>
+      <w:tblPr>
+        <w:tblStyle w:val="LightGrid-Accent1"/>
+        <w:tblW w:type="auto" w:w="0"/>
+        <w:tblLayout w:type="autofit"/>
+        <w:tblLook w:firstColumn="1" w:firstRow="1" w:lastColumn="0" w:lastRow="0" w:noHBand="0" w:noVBand="1" w:val="04A0"/>
+      </w:tblPr>
+      <w:tblGrid>
+        <w:gridCol w:w="2409"/>
+        <w:gridCol w:w="2409"/>
+        <w:gridCol w:w="2409"/>
+        <w:gridCol w:w="2409"/>
+      </w:tblGrid>
+      <w:tr>
+        <w:tc>
+          <w:tcPr>
+            <w:tcW w:type="dxa" w:w="2409"/>
+            <w:vAlign w:val="top"/>
+            <w:shd w:val="clear" w:color="auto" w:fill="0B4EA2"/>
+          </w:tcPr>
+          <w:p>
+            <w:r/>
+            <w:r>
+              <w:rPr>
+                <w:b/>
+                <w:color w:val="FFFFFF"/>
+                <w:sz w:val="19"/>
+              </w:rPr>
+              <w:t>Field</w:t>
+            </w:r>
+          </w:p>
+        </w:tc>
+        <w:tc>
+          <w:tcPr>
+            <w:tcW w:type="dxa" w:w="2409"/>
+            <w:vAlign w:val="top"/>
+            <w:shd w:val="clear" w:color="auto" w:fill="0B4EA2"/>
+          </w:tcPr>
+          <w:p>
+            <w:r/>
+            <w:r>
+              <w:rPr>
+                <w:b/>
+                <w:color w:val="FFFFFF"/>
+                <w:sz w:val="19"/>
+              </w:rPr>
+              <w:t>Type</w:t>
+            </w:r>
+          </w:p>
+        </w:tc>
+        <w:tc>
+          <w:tcPr>
+            <w:tcW w:type="dxa" w:w="2409"/>
+            <w:vAlign w:val="top"/>
+            <w:shd w:val="clear" w:color="auto" w:fill="0B4EA2"/>
+          </w:tcPr>
+          <w:p>
+            <w:r/>
+            <w:r>
+              <w:rPr>
+                <w:b/>
+                <w:color w:val="FFFFFF"/>
+                <w:sz w:val="19"/>
+              </w:rPr>
+              <w:t>Required</w:t>
+            </w:r>
+          </w:p>
+        </w:tc>
+        <w:tc>
+          <w:tcPr>
+            <w:tcW w:type="dxa" w:w="2409"/>
+            <w:vAlign w:val="top"/>
+            <w:shd w:val="clear" w:color="auto" w:fill="0B4EA2"/>
+          </w:tcPr>
+          <w:p>
+            <w:r/>
+            <w:r>
+              <w:rPr>
+                <w:b/>
+                <w:color w:val="FFFFFF"/>
+                <w:sz w:val="19"/>
+              </w:rPr>
+              <w:t>Description</w:t>
+            </w:r>
+          </w:p>
+        </w:tc>
+      </w:tr>
+      <w:tr>
+        <w:tc>
+          <w:tcPr>
+            <w:tcW w:type="dxa" w:w="2409"/>
+            <w:vAlign w:val="top"/>
+          </w:tcPr>
+          <w:p>
+            <w:r/>
+            <w:r>
+              <w:rPr>
+                <w:sz w:val="19"/>
+              </w:rPr>
+              <w:t>charger_id</w:t>
+            </w:r>
+          </w:p>
+        </w:tc>
+        <w:tc>
+          <w:tcPr>
+            <w:tcW w:type="dxa" w:w="2409"/>
+            <w:vAlign w:val="top"/>
+          </w:tcPr>
+          <w:p>
+            <w:r/>
+            <w:r>
+              <w:rPr>
+                <w:sz w:val="19"/>
+              </w:rPr>
+              <w:t>string</w:t>
+            </w:r>
+          </w:p>
+        </w:tc>
+        <w:tc>
+          <w:tcPr>
+            <w:tcW w:type="dxa" w:w="2409"/>
+            <w:vAlign w:val="top"/>
+          </w:tcPr>
+          <w:p>
+            <w:r/>
+            <w:r>
+              <w:rPr>
+                <w:sz w:val="19"/>
+              </w:rPr>
+              <w:t>Yes</w:t>
+            </w:r>
+          </w:p>
+        </w:tc>
+        <w:tc>
+          <w:tcPr>
+            <w:tcW w:type="dxa" w:w="2409"/>
+            <w:vAlign w:val="top"/>
+          </w:tcPr>
+          <w:p>
+            <w:r/>
+            <w:r>
+              <w:rPr>
+                <w:sz w:val="19"/>
+              </w:rPr>
+              <w:t>Physical charger ID</w:t>
+            </w:r>
+          </w:p>
+        </w:tc>
+      </w:tr>
+      <w:tr>
+        <w:tc>
+          <w:tcPr>
+            <w:tcW w:type="dxa" w:w="2409"/>
+            <w:vAlign w:val="top"/>
+            <w:shd w:val="clear" w:color="auto" w:fill="F2F5FA"/>
+          </w:tcPr>
+          <w:p>
+            <w:r/>
+            <w:r>
+              <w:rPr>
+                <w:sz w:val="19"/>
+              </w:rPr>
+              <w:t>home_number</w:t>
+            </w:r>
+          </w:p>
+        </w:tc>
+        <w:tc>
+          <w:tcPr>
+            <w:tcW w:type="dxa" w:w="2409"/>
+            <w:vAlign w:val="top"/>
+            <w:shd w:val="clear" w:color="auto" w:fill="F2F5FA"/>
+          </w:tcPr>
+          <w:p>
+            <w:r/>
+            <w:r>
+              <w:rPr>
+                <w:sz w:val="19"/>
+              </w:rPr>
+              <w:t>string</w:t>
+            </w:r>
+          </w:p>
+        </w:tc>
+        <w:tc>
+          <w:tcPr>
+            <w:tcW w:type="dxa" w:w="2409"/>
+            <w:vAlign w:val="top"/>
+            <w:shd w:val="clear" w:color="auto" w:fill="F2F5FA"/>
+          </w:tcPr>
+          <w:p>
+            <w:r/>
+            <w:r>
+              <w:rPr>
+                <w:sz w:val="19"/>
+              </w:rPr>
+              <w:t>No</w:t>
+            </w:r>
+          </w:p>
+        </w:tc>
+        <w:tc>
+          <w:tcPr>
+            <w:tcW w:type="dxa" w:w="2409"/>
+            <w:vAlign w:val="top"/>
+            <w:shd w:val="clear" w:color="auto" w:fill="F2F5FA"/>
+          </w:tcPr>
+          <w:p>
+            <w:r/>
+            <w:r>
+              <w:rPr>
+                <w:sz w:val="19"/>
+              </w:rPr>
+              <w:t>LCD header text, max 24 characters</w:t>
+            </w:r>
+          </w:p>
+        </w:tc>
+      </w:tr>
+      <w:tr>
+        <w:tc>
+          <w:tcPr>
+            <w:tcW w:type="dxa" w:w="2409"/>
+            <w:vAlign w:val="top"/>
+          </w:tcPr>
+          <w:p>
+            <w:r/>
+            <w:r>
+              <w:rPr>
+                <w:sz w:val="19"/>
+              </w:rPr>
+              <w:t>background</w:t>
+            </w:r>
+          </w:p>
+        </w:tc>
+        <w:tc>
+          <w:tcPr>
+            <w:tcW w:type="dxa" w:w="2409"/>
+            <w:vAlign w:val="top"/>
+          </w:tcPr>
+          <w:p>
+            <w:r/>
+            <w:r>
+              <w:rPr>
+                <w:sz w:val="19"/>
+              </w:rPr>
+              <w:t>string</w:t>
+            </w:r>
+          </w:p>
+        </w:tc>
+        <w:tc>
+          <w:tcPr>
+            <w:tcW w:type="dxa" w:w="2409"/>
+            <w:vAlign w:val="top"/>
+          </w:tcPr>
+          <w:p>
+            <w:r/>
+            <w:r>
+              <w:rPr>
+                <w:sz w:val="19"/>
+              </w:rPr>
+              <w:t>No</w:t>
+            </w:r>
+          </w:p>
+        </w:tc>
+        <w:tc>
+          <w:tcPr>
+            <w:tcW w:type="dxa" w:w="2409"/>
+            <w:vAlign w:val="top"/>
+          </w:tcPr>
+          <w:p>
+            <w:r/>
+            <w:r>
+              <w:rPr>
+                <w:sz w:val="19"/>
+              </w:rPr>
+              <w:t>Wallpaper preset name (e.g. Verdant Pulse, Eco Wave, Nature, Aurora, Ocean, Neon, Classic)</w:t>
+            </w:r>
+          </w:p>
+        </w:tc>
+      </w:tr>
+    </w:tbl>
+    <w:p/>
+    <w:p>
+      <w:r>
+        <w:rPr>
+          <w:b/>
+        </w:rPr>
+        <w:t>Example</w:t>
+      </w:r>
+    </w:p>
+    <w:p>
+      <w:pPr>
+        <w:spacing w:before="80" w:after="160"/>
+        <w:ind w:left="283"/>
+        <w:shd w:val="clear" w:color="auto" w:fill="F4F4F4"/>
+      </w:pPr>
+      <w:r>
+        <w:rPr>
+          <w:rFonts w:ascii="Consolas" w:hAnsi="Consolas"/>
+          <w:sz w:val="18"/>
+        </w:rPr>
+        <w:t>curl -X POST https://charger.czeros.tech/ocpi/2.2.1/aion/display \</w:t>
+        <w:br/>
+        <w:t xml:space="preserve">  -H "Authorization: Token $OCPI_TOKEN" \</w:t>
+        <w:br/>
+        <w:t xml:space="preserve">  -H "Content-Type: application/json" \</w:t>
+        <w:br/>
+        <w:t xml:space="preserve">  -d '{"charger_id":"0748911403000093","home_number":"PLAGSINI KL","background":"Aurora"}'</w:t>
+      </w:r>
+    </w:p>
+    <w:p>
+      <w:r>
+        <w:rPr>
+          <w:b/>
+        </w:rPr>
+        <w:t>Response 200</w:t>
+      </w:r>
+    </w:p>
+    <w:p>
+      <w:pPr>
+        <w:spacing w:before="80" w:after="160"/>
+        <w:ind w:left="283"/>
+        <w:shd w:val="clear" w:color="auto" w:fill="F4F4F4"/>
+      </w:pPr>
+      <w:r>
+        <w:rPr>
+          <w:rFonts w:ascii="Consolas" w:hAnsi="Consolas"/>
+          <w:sz w:val="18"/>
+        </w:rPr>
+        <w:t>{</w:t>
+        <w:br/>
+        <w:t xml:space="preserve">  "status_code": 1000,</w:t>
+        <w:br/>
+        <w:t xml:space="preserve">  "status_message": "Success",</w:t>
+        <w:br/>
+        <w:t xml:space="preserve">  "timestamp": "2026-07-15T03:09:38Z",</w:t>
+        <w:br/>
+        <w:t xml:space="preserve">  "data": {</w:t>
+        <w:br/>
+        <w:t xml:space="preserve">    "charger_id": "0748911403000093",</w:t>
+        <w:br/>
+        <w:t xml:space="preserve">    "applied": ["HomeNumber", "BackSelection"]</w:t>
+        <w:br/>
+        <w:t xml:space="preserve">  }</w:t>
+        <w:br/>
+        <w:t>}</w:t>
+      </w:r>
+    </w:p>
+    <w:p>
+      <w:pPr>
+        <w:spacing w:before="200" w:after="120"/>
+      </w:pPr>
+      <w:r>
+        <w:rPr>
+          <w:b/>
+          <w:color w:val="1A1A1A"/>
+          <w:sz w:val="26"/>
+        </w:rPr>
+        <w:t>`GET /ocpi/2.2.1/aion/display?charger_id={id}`</w:t>
+      </w:r>
+    </w:p>
+    <w:p>
+      <w:pPr>
+        <w:spacing w:before="80" w:after="160"/>
+        <w:ind w:left="283"/>
+        <w:shd w:val="clear" w:color="auto" w:fill="F4F4F4"/>
+      </w:pPr>
+      <w:r>
+        <w:rPr>
+          <w:rFonts w:ascii="Consolas" w:hAnsi="Consolas"/>
+          <w:sz w:val="18"/>
+        </w:rPr>
+        <w:t>{</w:t>
+        <w:br/>
+        <w:t xml:space="preserve">  "charger_id": "0748911403000093",</w:t>
+        <w:br/>
+        <w:t xml:space="preserve">  "home_number": "PLAGSINI KL",</w:t>
+        <w:br/>
+        <w:t xml:space="preserve">  "background": "Aurora"</w:t>
+        <w:br/>
+        <w:t>}</w:t>
+      </w:r>
+    </w:p>
+    <w:p>
+      <w:pPr>
+        <w:pBdr>
+          <w:bottom w:val="single" w:sz="8" w:color="0B4EA2"/>
+        </w:pBdr>
+      </w:pPr>
+    </w:p>
+    <w:p>
+      <w:pPr>
+        <w:spacing w:before="200" w:after="120"/>
+      </w:pPr>
+      <w:r>
+        <w:rPr>
+          <w:b/>
+          <w:color w:val="0B4EA2"/>
+          <w:sz w:val="32"/>
+        </w:rPr>
+        <w:t>5.13.3 Local Admin Credentials</w:t>
+      </w:r>
+    </w:p>
+    <w:p>
+      <w:r>
+        <w:t xml:space="preserve">Change the credentials used to log in to the AION on-device web console (used by technicians on site). These credentials are </w:t>
+      </w:r>
+      <w:r>
+        <w:rPr>
+          <w:b/>
+        </w:rPr>
+        <w:t>unrelated</w:t>
+      </w:r>
+      <w:r>
+        <w:t xml:space="preserve"> to the OCPI token or OCPP authentication key.</w:t>
+      </w:r>
+    </w:p>
+    <w:p>
+      <w:pPr>
+        <w:spacing w:before="200" w:after="120"/>
+      </w:pPr>
+      <w:r>
+        <w:rPr>
+          <w:b/>
+          <w:color w:val="1A1A1A"/>
+          <w:sz w:val="26"/>
+        </w:rPr>
+        <w:t>`POST /ocpi/2.2.1/aion/credentials`</w:t>
+      </w:r>
+    </w:p>
+    <w:p>
+      <w:r>
+        <w:rPr>
+          <w:b/>
+        </w:rPr>
+        <w:t>Request body</w:t>
+      </w:r>
+    </w:p>
+    <w:tbl>
+      <w:tblPr>
+        <w:tblStyle w:val="LightGrid-Accent1"/>
+        <w:tblW w:type="auto" w:w="0"/>
+        <w:tblLayout w:type="autofit"/>
+        <w:tblLook w:firstColumn="1" w:firstRow="1" w:lastColumn="0" w:lastRow="0" w:noHBand="0" w:noVBand="1" w:val="04A0"/>
+      </w:tblPr>
+      <w:tblGrid>
+        <w:gridCol w:w="2409"/>
+        <w:gridCol w:w="2409"/>
+        <w:gridCol w:w="2409"/>
+        <w:gridCol w:w="2409"/>
+      </w:tblGrid>
+      <w:tr>
+        <w:tc>
+          <w:tcPr>
+            <w:tcW w:type="dxa" w:w="2409"/>
+            <w:vAlign w:val="top"/>
+            <w:shd w:val="clear" w:color="auto" w:fill="0B4EA2"/>
+          </w:tcPr>
+          <w:p>
+            <w:r/>
+            <w:r>
+              <w:rPr>
+                <w:b/>
+                <w:color w:val="FFFFFF"/>
+                <w:sz w:val="19"/>
+              </w:rPr>
+              <w:t>Field</w:t>
+            </w:r>
+          </w:p>
+        </w:tc>
+        <w:tc>
+          <w:tcPr>
+            <w:tcW w:type="dxa" w:w="2409"/>
+            <w:vAlign w:val="top"/>
+            <w:shd w:val="clear" w:color="auto" w:fill="0B4EA2"/>
+          </w:tcPr>
+          <w:p>
+            <w:r/>
+            <w:r>
+              <w:rPr>
+                <w:b/>
+                <w:color w:val="FFFFFF"/>
+                <w:sz w:val="19"/>
+              </w:rPr>
+              <w:t>Type</w:t>
+            </w:r>
+          </w:p>
+        </w:tc>
+        <w:tc>
+          <w:tcPr>
+            <w:tcW w:type="dxa" w:w="2409"/>
+            <w:vAlign w:val="top"/>
+            <w:shd w:val="clear" w:color="auto" w:fill="0B4EA2"/>
+          </w:tcPr>
+          <w:p>
+            <w:r/>
+            <w:r>
+              <w:rPr>
+                <w:b/>
+                <w:color w:val="FFFFFF"/>
+                <w:sz w:val="19"/>
+              </w:rPr>
+              <w:t>Required</w:t>
+            </w:r>
+          </w:p>
+        </w:tc>
+        <w:tc>
+          <w:tcPr>
+            <w:tcW w:type="dxa" w:w="2409"/>
+            <w:vAlign w:val="top"/>
+            <w:shd w:val="clear" w:color="auto" w:fill="0B4EA2"/>
+          </w:tcPr>
+          <w:p>
+            <w:r/>
+            <w:r>
+              <w:rPr>
+                <w:b/>
+                <w:color w:val="FFFFFF"/>
+                <w:sz w:val="19"/>
+              </w:rPr>
+              <w:t>Description</w:t>
+            </w:r>
+          </w:p>
+        </w:tc>
+      </w:tr>
+      <w:tr>
+        <w:tc>
+          <w:tcPr>
+            <w:tcW w:type="dxa" w:w="2409"/>
+            <w:vAlign w:val="top"/>
+          </w:tcPr>
+          <w:p>
+            <w:r/>
+            <w:r>
+              <w:rPr>
+                <w:sz w:val="19"/>
+              </w:rPr>
+              <w:t>charger_id</w:t>
+            </w:r>
+          </w:p>
+        </w:tc>
+        <w:tc>
+          <w:tcPr>
+            <w:tcW w:type="dxa" w:w="2409"/>
+            <w:vAlign w:val="top"/>
+          </w:tcPr>
+          <w:p>
+            <w:r/>
+            <w:r>
+              <w:rPr>
+                <w:sz w:val="19"/>
+              </w:rPr>
+              <w:t>string</w:t>
+            </w:r>
+          </w:p>
+        </w:tc>
+        <w:tc>
+          <w:tcPr>
+            <w:tcW w:type="dxa" w:w="2409"/>
+            <w:vAlign w:val="top"/>
+          </w:tcPr>
+          <w:p>
+            <w:r/>
+            <w:r>
+              <w:rPr>
+                <w:sz w:val="19"/>
+              </w:rPr>
+              <w:t>Yes</w:t>
+            </w:r>
+          </w:p>
+        </w:tc>
+        <w:tc>
+          <w:tcPr>
+            <w:tcW w:type="dxa" w:w="2409"/>
+            <w:vAlign w:val="top"/>
+          </w:tcPr>
+          <w:p>
+            <w:r/>
+            <w:r>
+              <w:rPr>
+                <w:sz w:val="19"/>
+              </w:rPr>
+              <w:t>Physical charger ID</w:t>
+            </w:r>
+          </w:p>
+        </w:tc>
+      </w:tr>
+      <w:tr>
+        <w:tc>
+          <w:tcPr>
+            <w:tcW w:type="dxa" w:w="2409"/>
+            <w:vAlign w:val="top"/>
+            <w:shd w:val="clear" w:color="auto" w:fill="F2F5FA"/>
+          </w:tcPr>
+          <w:p>
+            <w:r/>
+            <w:r>
+              <w:rPr>
+                <w:sz w:val="19"/>
+              </w:rPr>
+              <w:t>username</w:t>
+            </w:r>
+          </w:p>
+        </w:tc>
+        <w:tc>
+          <w:tcPr>
+            <w:tcW w:type="dxa" w:w="2409"/>
+            <w:vAlign w:val="top"/>
+            <w:shd w:val="clear" w:color="auto" w:fill="F2F5FA"/>
+          </w:tcPr>
+          <w:p>
+            <w:r/>
+            <w:r>
+              <w:rPr>
+                <w:sz w:val="19"/>
+              </w:rPr>
+              <w:t>string</w:t>
+            </w:r>
+          </w:p>
+        </w:tc>
+        <w:tc>
+          <w:tcPr>
+            <w:tcW w:type="dxa" w:w="2409"/>
+            <w:vAlign w:val="top"/>
+            <w:shd w:val="clear" w:color="auto" w:fill="F2F5FA"/>
+          </w:tcPr>
+          <w:p>
+            <w:r/>
+            <w:r>
+              <w:rPr>
+                <w:sz w:val="19"/>
+              </w:rPr>
+              <w:t>No</w:t>
+            </w:r>
+          </w:p>
+        </w:tc>
+        <w:tc>
+          <w:tcPr>
+            <w:tcW w:type="dxa" w:w="2409"/>
+            <w:vAlign w:val="top"/>
+            <w:shd w:val="clear" w:color="auto" w:fill="F2F5FA"/>
+          </w:tcPr>
+          <w:p>
+            <w:r/>
+            <w:r>
+              <w:rPr>
+                <w:sz w:val="19"/>
+              </w:rPr>
+              <w:t>New username, max 32 chars</w:t>
+            </w:r>
+          </w:p>
+        </w:tc>
+      </w:tr>
+      <w:tr>
+        <w:tc>
+          <w:tcPr>
+            <w:tcW w:type="dxa" w:w="2409"/>
+            <w:vAlign w:val="top"/>
+          </w:tcPr>
+          <w:p>
+            <w:r/>
+            <w:r>
+              <w:rPr>
+                <w:sz w:val="19"/>
+              </w:rPr>
+              <w:t>password</w:t>
+            </w:r>
+          </w:p>
+        </w:tc>
+        <w:tc>
+          <w:tcPr>
+            <w:tcW w:type="dxa" w:w="2409"/>
+            <w:vAlign w:val="top"/>
+          </w:tcPr>
+          <w:p>
+            <w:r/>
+            <w:r>
+              <w:rPr>
+                <w:sz w:val="19"/>
+              </w:rPr>
+              <w:t>string</w:t>
+            </w:r>
+          </w:p>
+        </w:tc>
+        <w:tc>
+          <w:tcPr>
+            <w:tcW w:type="dxa" w:w="2409"/>
+            <w:vAlign w:val="top"/>
+          </w:tcPr>
+          <w:p>
+            <w:r/>
+            <w:r>
+              <w:rPr>
+                <w:sz w:val="19"/>
+              </w:rPr>
+              <w:t>No</w:t>
+            </w:r>
+          </w:p>
+        </w:tc>
+        <w:tc>
+          <w:tcPr>
+            <w:tcW w:type="dxa" w:w="2409"/>
+            <w:vAlign w:val="top"/>
+          </w:tcPr>
+          <w:p>
+            <w:r/>
+            <w:r>
+              <w:rPr>
+                <w:sz w:val="19"/>
+              </w:rPr>
+              <w:t>New password, max 32 chars</w:t>
+            </w:r>
+          </w:p>
+        </w:tc>
+      </w:tr>
+    </w:tbl>
+    <w:p/>
+    <w:p>
+      <w:r>
+        <w:rPr>
+          <w:b/>
+        </w:rPr>
+        <w:t>Response 200</w:t>
+      </w:r>
+    </w:p>
+    <w:p>
+      <w:pPr>
+        <w:spacing w:before="80" w:after="160"/>
+        <w:ind w:left="283"/>
+        <w:shd w:val="clear" w:color="auto" w:fill="F4F4F4"/>
+      </w:pPr>
+      <w:r>
+        <w:rPr>
+          <w:rFonts w:ascii="Consolas" w:hAnsi="Consolas"/>
+          <w:sz w:val="18"/>
+        </w:rPr>
+        <w:t>{</w:t>
+        <w:br/>
+        <w:t xml:space="preserve">  "status_code": 1000,</w:t>
+        <w:br/>
+        <w:t xml:space="preserve">  "status_message": "Success",</w:t>
+        <w:br/>
+        <w:t xml:space="preserve">  "timestamp": "2026-07-15T03:09:38Z",</w:t>
+        <w:br/>
+        <w:t xml:space="preserve">  "data": {</w:t>
+        <w:br/>
+        <w:t xml:space="preserve">    "charger_id": "0748911403000093",</w:t>
+        <w:br/>
+        <w:t xml:space="preserve">    "applied": ["UserName", "UserPass"]</w:t>
+        <w:br/>
+        <w:t xml:space="preserve">  }</w:t>
+        <w:br/>
+        <w:t>}</w:t>
+      </w:r>
+    </w:p>
+    <w:p>
+      <w:pPr>
+        <w:spacing w:before="200" w:after="120"/>
+      </w:pPr>
+      <w:r>
+        <w:rPr>
+          <w:b/>
+          <w:color w:val="1A1A1A"/>
+          <w:sz w:val="26"/>
+        </w:rPr>
+        <w:t>`GET /ocpi/2.2.1/aion/credentials?charger_id={id}`</w:t>
+      </w:r>
+    </w:p>
+    <w:p>
+      <w:r>
+        <w:t xml:space="preserve">Returns username only. </w:t>
+      </w:r>
+      <w:r>
+        <w:rPr>
+          <w:b/>
+        </w:rPr>
+        <w:t>Password is never echoed</w:t>
+      </w:r>
+      <w:r>
+        <w:t xml:space="preserve"> — rotate via POST if the password is lost.</w:t>
+      </w:r>
+    </w:p>
+    <w:p>
+      <w:pPr>
+        <w:spacing w:before="80" w:after="160"/>
+        <w:ind w:left="283"/>
+        <w:shd w:val="clear" w:color="auto" w:fill="F4F4F4"/>
+      </w:pPr>
+      <w:r>
+        <w:rPr>
+          <w:rFonts w:ascii="Consolas" w:hAnsi="Consolas"/>
+          <w:sz w:val="18"/>
+        </w:rPr>
+        <w:t>{</w:t>
+        <w:br/>
+        <w:t xml:space="preserve">  "charger_id": "0748911403000093",</w:t>
+        <w:br/>
+        <w:t xml:space="preserve">  "username": "admin"</w:t>
+        <w:br/>
+        <w:t>}</w:t>
+      </w:r>
+    </w:p>
+    <w:p>
+      <w:pPr>
+        <w:pBdr>
+          <w:bottom w:val="single" w:sz="8" w:color="0B4EA2"/>
+        </w:pBdr>
+      </w:pPr>
+    </w:p>
+    <w:p>
+      <w:pPr>
+        <w:spacing w:before="200" w:after="120"/>
+      </w:pPr>
+      <w:r>
+        <w:rPr>
+          <w:b/>
+          <w:color w:val="0B4EA2"/>
+          <w:sz w:val="32"/>
+        </w:rPr>
+        <w:t>5.13.4 Schedule — Auto start/stop window</w:t>
+      </w:r>
+    </w:p>
+    <w:p>
+      <w:r>
+        <w:t>Configure the single auto start/stop window supported by AION firmware v2.0.04.</w:t>
+      </w:r>
+    </w:p>
+    <w:p>
+      <w:r>
+        <w:t xml:space="preserve">Sends </w:t>
+      </w:r>
+      <w:r>
+        <w:rPr>
+          <w:rFonts w:ascii="Consolas" w:hAnsi="Consolas"/>
+          <w:sz w:val="19"/>
+        </w:rPr>
+        <w:t>Sch_State</w:t>
+      </w:r>
+      <w:r>
+        <w:t xml:space="preserve">, </w:t>
+      </w:r>
+      <w:r>
+        <w:rPr>
+          <w:rFonts w:ascii="Consolas" w:hAnsi="Consolas"/>
+          <w:sz w:val="19"/>
+        </w:rPr>
+        <w:t>Sch_Day</w:t>
+      </w:r>
+      <w:r>
+        <w:t xml:space="preserve">, </w:t>
+      </w:r>
+      <w:r>
+        <w:rPr>
+          <w:rFonts w:ascii="Consolas" w:hAnsi="Consolas"/>
+          <w:sz w:val="19"/>
+        </w:rPr>
+        <w:t>Sch_StartTime</w:t>
+      </w:r>
+      <w:r>
+        <w:t xml:space="preserve">, </w:t>
+      </w:r>
+      <w:r>
+        <w:rPr>
+          <w:rFonts w:ascii="Consolas" w:hAnsi="Consolas"/>
+          <w:sz w:val="19"/>
+        </w:rPr>
+        <w:t>Sch_StopTime</w:t>
+      </w:r>
+      <w:r>
+        <w:t xml:space="preserve"> via OCPP </w:t>
+      </w:r>
+      <w:r>
+        <w:rPr>
+          <w:rFonts w:ascii="Consolas" w:hAnsi="Consolas"/>
+          <w:sz w:val="19"/>
+        </w:rPr>
+        <w:t>ChangeConfiguration</w:t>
+      </w:r>
+      <w:r>
+        <w:t>.</w:t>
+      </w:r>
+    </w:p>
+    <w:p>
+      <w:pPr>
+        <w:spacing w:before="200" w:after="120"/>
+      </w:pPr>
+      <w:r>
+        <w:rPr>
+          <w:b/>
+          <w:color w:val="1A1A1A"/>
+          <w:sz w:val="26"/>
+        </w:rPr>
+        <w:t>`POST /ocpi/2.2.1/aion/schedule`</w:t>
+      </w:r>
+    </w:p>
+    <w:p>
+      <w:r>
+        <w:rPr>
+          <w:b/>
+        </w:rPr>
+        <w:t>Request body</w:t>
+      </w:r>
+    </w:p>
+    <w:tbl>
+      <w:tblPr>
+        <w:tblStyle w:val="LightGrid-Accent1"/>
+        <w:tblW w:type="auto" w:w="0"/>
+        <w:tblLayout w:type="autofit"/>
+        <w:tblLook w:firstColumn="1" w:firstRow="1" w:lastColumn="0" w:lastRow="0" w:noHBand="0" w:noVBand="1" w:val="04A0"/>
+      </w:tblPr>
+      <w:tblGrid>
+        <w:gridCol w:w="2409"/>
+        <w:gridCol w:w="2409"/>
+        <w:gridCol w:w="2409"/>
+        <w:gridCol w:w="2409"/>
+      </w:tblGrid>
+      <w:tr>
+        <w:tc>
+          <w:tcPr>
+            <w:tcW w:type="dxa" w:w="2409"/>
+            <w:vAlign w:val="top"/>
+            <w:shd w:val="clear" w:color="auto" w:fill="0B4EA2"/>
+          </w:tcPr>
+          <w:p>
+            <w:r/>
+            <w:r>
+              <w:rPr>
+                <w:b/>
+                <w:color w:val="FFFFFF"/>
+                <w:sz w:val="19"/>
+              </w:rPr>
+              <w:t>Field</w:t>
+            </w:r>
+          </w:p>
+        </w:tc>
+        <w:tc>
+          <w:tcPr>
+            <w:tcW w:type="dxa" w:w="2409"/>
+            <w:vAlign w:val="top"/>
+            <w:shd w:val="clear" w:color="auto" w:fill="0B4EA2"/>
+          </w:tcPr>
+          <w:p>
+            <w:r/>
+            <w:r>
+              <w:rPr>
+                <w:b/>
+                <w:color w:val="FFFFFF"/>
+                <w:sz w:val="19"/>
+              </w:rPr>
+              <w:t>Type</w:t>
+            </w:r>
+          </w:p>
+        </w:tc>
+        <w:tc>
+          <w:tcPr>
+            <w:tcW w:type="dxa" w:w="2409"/>
+            <w:vAlign w:val="top"/>
+            <w:shd w:val="clear" w:color="auto" w:fill="0B4EA2"/>
+          </w:tcPr>
+          <w:p>
+            <w:r/>
+            <w:r>
+              <w:rPr>
+                <w:b/>
+                <w:color w:val="FFFFFF"/>
+                <w:sz w:val="19"/>
+              </w:rPr>
+              <w:t>Required</w:t>
+            </w:r>
+          </w:p>
+        </w:tc>
+        <w:tc>
+          <w:tcPr>
+            <w:tcW w:type="dxa" w:w="2409"/>
+            <w:vAlign w:val="top"/>
+            <w:shd w:val="clear" w:color="auto" w:fill="0B4EA2"/>
+          </w:tcPr>
+          <w:p>
+            <w:r/>
+            <w:r>
+              <w:rPr>
+                <w:b/>
+                <w:color w:val="FFFFFF"/>
+                <w:sz w:val="19"/>
+              </w:rPr>
+              <w:t>Description</w:t>
+            </w:r>
+          </w:p>
+        </w:tc>
+      </w:tr>
+      <w:tr>
+        <w:tc>
+          <w:tcPr>
+            <w:tcW w:type="dxa" w:w="2409"/>
+            <w:vAlign w:val="top"/>
+          </w:tcPr>
+          <w:p>
+            <w:r/>
+            <w:r>
+              <w:rPr>
+                <w:sz w:val="19"/>
+              </w:rPr>
+              <w:t>charger_id</w:t>
+            </w:r>
+          </w:p>
+        </w:tc>
+        <w:tc>
+          <w:tcPr>
+            <w:tcW w:type="dxa" w:w="2409"/>
+            <w:vAlign w:val="top"/>
+          </w:tcPr>
+          <w:p>
+            <w:r/>
+            <w:r>
+              <w:rPr>
+                <w:sz w:val="19"/>
+              </w:rPr>
+              <w:t>string</w:t>
+            </w:r>
+          </w:p>
+        </w:tc>
+        <w:tc>
+          <w:tcPr>
+            <w:tcW w:type="dxa" w:w="2409"/>
+            <w:vAlign w:val="top"/>
+          </w:tcPr>
+          <w:p>
+            <w:r/>
+            <w:r>
+              <w:rPr>
+                <w:sz w:val="19"/>
+              </w:rPr>
+              <w:t>Yes</w:t>
+            </w:r>
+          </w:p>
+        </w:tc>
+        <w:tc>
+          <w:tcPr>
+            <w:tcW w:type="dxa" w:w="2409"/>
+            <w:vAlign w:val="top"/>
+          </w:tcPr>
+          <w:p>
+            <w:r/>
+            <w:r>
+              <w:rPr>
+                <w:sz w:val="19"/>
+              </w:rPr>
+              <w:t>Physical charger ID</w:t>
+            </w:r>
+          </w:p>
+        </w:tc>
+      </w:tr>
+      <w:tr>
+        <w:tc>
+          <w:tcPr>
+            <w:tcW w:type="dxa" w:w="2409"/>
+            <w:vAlign w:val="top"/>
+            <w:shd w:val="clear" w:color="auto" w:fill="F2F5FA"/>
+          </w:tcPr>
+          <w:p>
+            <w:r/>
+            <w:r>
+              <w:rPr>
+                <w:sz w:val="19"/>
+              </w:rPr>
+              <w:t>enabled</w:t>
+            </w:r>
+          </w:p>
+        </w:tc>
+        <w:tc>
+          <w:tcPr>
+            <w:tcW w:type="dxa" w:w="2409"/>
+            <w:vAlign w:val="top"/>
+            <w:shd w:val="clear" w:color="auto" w:fill="F2F5FA"/>
+          </w:tcPr>
+          <w:p>
+            <w:r/>
+            <w:r>
+              <w:rPr>
+                <w:sz w:val="19"/>
+              </w:rPr>
+              <w:t>boolean</w:t>
+            </w:r>
+          </w:p>
+        </w:tc>
+        <w:tc>
+          <w:tcPr>
+            <w:tcW w:type="dxa" w:w="2409"/>
+            <w:vAlign w:val="top"/>
+            <w:shd w:val="clear" w:color="auto" w:fill="F2F5FA"/>
+          </w:tcPr>
+          <w:p>
+            <w:r/>
+            <w:r>
+              <w:rPr>
+                <w:sz w:val="19"/>
+              </w:rPr>
+              <w:t>No</w:t>
+            </w:r>
+          </w:p>
+        </w:tc>
+        <w:tc>
+          <w:tcPr>
+            <w:tcW w:type="dxa" w:w="2409"/>
+            <w:vAlign w:val="top"/>
+            <w:shd w:val="clear" w:color="auto" w:fill="F2F5FA"/>
+          </w:tcPr>
+          <w:p>
+            <w:r/>
+            <w:r>
+              <w:rPr>
+                <w:sz w:val="19"/>
+              </w:rPr>
+              <w:t>true to activate the schedule, false to disable</w:t>
+            </w:r>
+          </w:p>
+        </w:tc>
+      </w:tr>
+      <w:tr>
+        <w:tc>
+          <w:tcPr>
+            <w:tcW w:type="dxa" w:w="2409"/>
+            <w:vAlign w:val="top"/>
+          </w:tcPr>
+          <w:p>
+            <w:r/>
+            <w:r>
+              <w:rPr>
+                <w:sz w:val="19"/>
+              </w:rPr>
+              <w:t>day</w:t>
+            </w:r>
+          </w:p>
+        </w:tc>
+        <w:tc>
+          <w:tcPr>
+            <w:tcW w:type="dxa" w:w="2409"/>
+            <w:vAlign w:val="top"/>
+          </w:tcPr>
+          <w:p>
+            <w:r/>
+            <w:r>
+              <w:rPr>
+                <w:sz w:val="19"/>
+              </w:rPr>
+              <w:t>integer</w:t>
+            </w:r>
+          </w:p>
+        </w:tc>
+        <w:tc>
+          <w:tcPr>
+            <w:tcW w:type="dxa" w:w="2409"/>
+            <w:vAlign w:val="top"/>
+          </w:tcPr>
+          <w:p>
+            <w:r/>
+            <w:r>
+              <w:rPr>
+                <w:sz w:val="19"/>
+              </w:rPr>
+              <w:t>No</w:t>
+            </w:r>
+          </w:p>
+        </w:tc>
+        <w:tc>
+          <w:tcPr>
+            <w:tcW w:type="dxa" w:w="2409"/>
+            <w:vAlign w:val="top"/>
+          </w:tcPr>
+          <w:p>
+            <w:r/>
+            <w:r>
+              <w:rPr>
+                <w:sz w:val="19"/>
+              </w:rPr>
+              <w:t>0 Sunday … 6 Saturday</w:t>
+            </w:r>
+          </w:p>
+        </w:tc>
+      </w:tr>
+      <w:tr>
+        <w:tc>
+          <w:tcPr>
+            <w:tcW w:type="dxa" w:w="2409"/>
+            <w:vAlign w:val="top"/>
+            <w:shd w:val="clear" w:color="auto" w:fill="F2F5FA"/>
+          </w:tcPr>
+          <w:p>
+            <w:r/>
+            <w:r>
+              <w:rPr>
+                <w:sz w:val="19"/>
+              </w:rPr>
+              <w:t>start_time</w:t>
+            </w:r>
+          </w:p>
+        </w:tc>
+        <w:tc>
+          <w:tcPr>
+            <w:tcW w:type="dxa" w:w="2409"/>
+            <w:vAlign w:val="top"/>
+            <w:shd w:val="clear" w:color="auto" w:fill="F2F5FA"/>
+          </w:tcPr>
+          <w:p>
+            <w:r/>
+            <w:r>
+              <w:rPr>
+                <w:sz w:val="19"/>
+              </w:rPr>
+              <w:t>string</w:t>
+            </w:r>
+          </w:p>
+        </w:tc>
+        <w:tc>
+          <w:tcPr>
+            <w:tcW w:type="dxa" w:w="2409"/>
+            <w:vAlign w:val="top"/>
+            <w:shd w:val="clear" w:color="auto" w:fill="F2F5FA"/>
+          </w:tcPr>
+          <w:p>
+            <w:r/>
+            <w:r>
+              <w:rPr>
+                <w:sz w:val="19"/>
+              </w:rPr>
+              <w:t>No</w:t>
+            </w:r>
+          </w:p>
+        </w:tc>
+        <w:tc>
+          <w:tcPr>
+            <w:tcW w:type="dxa" w:w="2409"/>
+            <w:vAlign w:val="top"/>
+            <w:shd w:val="clear" w:color="auto" w:fill="F2F5FA"/>
+          </w:tcPr>
+          <w:p>
+            <w:r/>
+            <w:r>
+              <w:rPr>
+                <w:sz w:val="19"/>
+              </w:rPr>
+              <w:t>HH:MM (24-hour)</w:t>
+            </w:r>
+          </w:p>
+        </w:tc>
+      </w:tr>
+      <w:tr>
+        <w:tc>
+          <w:tcPr>
+            <w:tcW w:type="dxa" w:w="2409"/>
+            <w:vAlign w:val="top"/>
+          </w:tcPr>
+          <w:p>
+            <w:r/>
+            <w:r>
+              <w:rPr>
+                <w:sz w:val="19"/>
+              </w:rPr>
+              <w:t>stop_time</w:t>
+            </w:r>
+          </w:p>
+        </w:tc>
+        <w:tc>
+          <w:tcPr>
+            <w:tcW w:type="dxa" w:w="2409"/>
+            <w:vAlign w:val="top"/>
+          </w:tcPr>
+          <w:p>
+            <w:r/>
+            <w:r>
+              <w:rPr>
+                <w:sz w:val="19"/>
+              </w:rPr>
+              <w:t>string</w:t>
+            </w:r>
+          </w:p>
+        </w:tc>
+        <w:tc>
+          <w:tcPr>
+            <w:tcW w:type="dxa" w:w="2409"/>
+            <w:vAlign w:val="top"/>
+          </w:tcPr>
+          <w:p>
+            <w:r/>
+            <w:r>
+              <w:rPr>
+                <w:sz w:val="19"/>
+              </w:rPr>
+              <w:t>No</w:t>
+            </w:r>
+          </w:p>
+        </w:tc>
+        <w:tc>
+          <w:tcPr>
+            <w:tcW w:type="dxa" w:w="2409"/>
+            <w:vAlign w:val="top"/>
+          </w:tcPr>
+          <w:p>
+            <w:r/>
+            <w:r>
+              <w:rPr>
+                <w:sz w:val="19"/>
+              </w:rPr>
+              <w:t>HH:MM (24-hour)</w:t>
+            </w:r>
+          </w:p>
+        </w:tc>
+      </w:tr>
+    </w:tbl>
+    <w:p/>
+    <w:p>
+      <w:r>
+        <w:rPr>
+          <w:b/>
+        </w:rPr>
+        <w:t>Example</w:t>
+      </w:r>
+    </w:p>
+    <w:p>
+      <w:pPr>
+        <w:spacing w:before="80" w:after="160"/>
+        <w:ind w:left="283"/>
+        <w:shd w:val="clear" w:color="auto" w:fill="F4F4F4"/>
+      </w:pPr>
+      <w:r>
+        <w:rPr>
+          <w:rFonts w:ascii="Consolas" w:hAnsi="Consolas"/>
+          <w:sz w:val="18"/>
+        </w:rPr>
+        <w:t>curl -X POST https://charger.czeros.tech/ocpi/2.2.1/aion/schedule \</w:t>
+        <w:br/>
+        <w:t xml:space="preserve">  -H "Authorization: Token $OCPI_TOKEN" \</w:t>
+        <w:br/>
+        <w:t xml:space="preserve">  -H "Content-Type: application/json" \</w:t>
+        <w:br/>
+        <w:t xml:space="preserve">  -d '{"charger_id":"0748911403000093","enabled":true,"day":1,"start_time":"10:00","stop_time":"18:00"}'</w:t>
+      </w:r>
+    </w:p>
+    <w:p>
+      <w:r>
+        <w:rPr>
+          <w:b/>
+        </w:rPr>
+        <w:t>Response 200</w:t>
+      </w:r>
+    </w:p>
+    <w:p>
+      <w:pPr>
+        <w:spacing w:before="80" w:after="160"/>
+        <w:ind w:left="283"/>
+        <w:shd w:val="clear" w:color="auto" w:fill="F4F4F4"/>
+      </w:pPr>
+      <w:r>
+        <w:rPr>
+          <w:rFonts w:ascii="Consolas" w:hAnsi="Consolas"/>
+          <w:sz w:val="18"/>
+        </w:rPr>
+        <w:t>{</w:t>
+        <w:br/>
+        <w:t xml:space="preserve">  "status_code": 1000,</w:t>
+        <w:br/>
+        <w:t xml:space="preserve">  "status_message": "Success",</w:t>
+        <w:br/>
+        <w:t xml:space="preserve">  "timestamp": "2026-07-15T03:09:48Z",</w:t>
+        <w:br/>
+        <w:t xml:space="preserve">  "data": {</w:t>
+        <w:br/>
+        <w:t xml:space="preserve">    "charger_id": "0748911403000093",</w:t>
+        <w:br/>
+        <w:t xml:space="preserve">    "applied": ["Sch_State", "Sch_Day", "Sch_StartTime", "Sch_StopTime"]</w:t>
+        <w:br/>
+        <w:t xml:space="preserve">  }</w:t>
+        <w:br/>
+        <w:t>}</w:t>
+      </w:r>
+    </w:p>
+    <w:p>
+      <w:pPr>
+        <w:spacing w:before="200" w:after="120"/>
+      </w:pPr>
+      <w:r>
+        <w:rPr>
+          <w:b/>
+          <w:color w:val="1A1A1A"/>
+          <w:sz w:val="26"/>
+        </w:rPr>
+        <w:t>`GET /ocpi/2.2.1/aion/schedule?charger_id={id}`</w:t>
+      </w:r>
+    </w:p>
+    <w:p>
+      <w:pPr>
+        <w:spacing w:before="80" w:after="160"/>
+        <w:ind w:left="283"/>
+        <w:shd w:val="clear" w:color="auto" w:fill="F4F4F4"/>
+      </w:pPr>
+      <w:r>
+        <w:rPr>
+          <w:rFonts w:ascii="Consolas" w:hAnsi="Consolas"/>
+          <w:sz w:val="18"/>
+        </w:rPr>
+        <w:t>{</w:t>
+        <w:br/>
+        <w:t xml:space="preserve">  "charger_id": "0748911403000093",</w:t>
+        <w:br/>
+        <w:t xml:space="preserve">  "enabled": true,</w:t>
+        <w:br/>
+        <w:t xml:space="preserve">  "day": 1,</w:t>
+        <w:br/>
+        <w:t xml:space="preserve">  "start_time": "10:00",</w:t>
+        <w:br/>
+        <w:t xml:space="preserve">  "stop_time": "18:00"</w:t>
+        <w:br/>
+        <w:t>}</w:t>
+      </w:r>
+    </w:p>
+    <w:p>
+      <w:r>
+        <w:rPr>
+          <w:b/>
+        </w:rPr>
+        <w:t>Limitation:</w:t>
+      </w:r>
+      <w:r>
+        <w:t xml:space="preserve"> AION firmware v2.0.04 supports one schedule window per charger. Multiple schedules or per-day windows are not currently supported.</w:t>
+      </w:r>
+    </w:p>
+    <w:p>
+      <w:pPr>
+        <w:pBdr>
+          <w:bottom w:val="single" w:sz="8" w:color="0B4EA2"/>
+        </w:pBdr>
+      </w:pPr>
+    </w:p>
+    <w:p>
+      <w:pPr>
+        <w:spacing w:before="200" w:after="120"/>
+      </w:pPr>
+      <w:r>
+        <w:rPr>
+          <w:b/>
+          <w:color w:val="0B4EA2"/>
+          <w:sz w:val="32"/>
+        </w:rPr>
+        <w:t>5.13.5 Lock — Availability toggle</w:t>
+      </w:r>
+    </w:p>
+    <w:p>
+      <w:r>
+        <w:t xml:space="preserve">Lock or unlock a charger (or a specific connector) via OCPP </w:t>
+      </w:r>
+      <w:r>
+        <w:rPr>
+          <w:rFonts w:ascii="Consolas" w:hAnsi="Consolas"/>
+          <w:sz w:val="19"/>
+        </w:rPr>
+        <w:t>ChangeAvailability</w:t>
+      </w:r>
+      <w:r>
+        <w:t xml:space="preserve">. Active sessions are </w:t>
+      </w:r>
+      <w:r>
+        <w:rPr>
+          <w:b/>
+        </w:rPr>
+        <w:t>not</w:t>
+      </w:r>
+      <w:r>
+        <w:t xml:space="preserve"> interrupted; only new sessions are affected.</w:t>
+      </w:r>
+    </w:p>
+    <w:p>
+      <w:pPr>
+        <w:pStyle w:val="ListBullet"/>
+      </w:pPr>
+      <w:r>
+        <w:rPr>
+          <w:rFonts w:ascii="Consolas" w:hAnsi="Consolas"/>
+          <w:sz w:val="19"/>
+        </w:rPr>
+        <w:t>lock</w:t>
+      </w:r>
+      <w:r>
+        <w:t xml:space="preserve"> → </w:t>
+      </w:r>
+      <w:r>
+        <w:rPr>
+          <w:rFonts w:ascii="Consolas" w:hAnsi="Consolas"/>
+          <w:sz w:val="19"/>
+        </w:rPr>
+        <w:t>Inoperative</w:t>
+      </w:r>
+      <w:r>
+        <w:t xml:space="preserve"> (charger refuses new sessions)</w:t>
+      </w:r>
+    </w:p>
+    <w:p>
+      <w:pPr>
+        <w:pStyle w:val="ListBullet"/>
+      </w:pPr>
+      <w:r>
+        <w:rPr>
+          <w:rFonts w:ascii="Consolas" w:hAnsi="Consolas"/>
+          <w:sz w:val="19"/>
+        </w:rPr>
+        <w:t>unlock</w:t>
+      </w:r>
+      <w:r>
+        <w:t xml:space="preserve"> → </w:t>
+      </w:r>
+      <w:r>
+        <w:rPr>
+          <w:rFonts w:ascii="Consolas" w:hAnsi="Consolas"/>
+          <w:sz w:val="19"/>
+        </w:rPr>
+        <w:t>Operative</w:t>
+      </w:r>
+      <w:r>
+        <w:t xml:space="preserve"> (normal operation)</w:t>
+      </w:r>
+    </w:p>
+    <w:p>
+      <w:pPr>
+        <w:spacing w:before="200" w:after="120"/>
+      </w:pPr>
+      <w:r>
+        <w:rPr>
+          <w:b/>
+          <w:color w:val="1A1A1A"/>
+          <w:sz w:val="26"/>
+        </w:rPr>
+        <w:t>`POST /ocpi/2.2.1/aion/lock`</w:t>
+      </w:r>
+    </w:p>
+    <w:p>
+      <w:r>
+        <w:rPr>
+          <w:b/>
+        </w:rPr>
+        <w:t>Request body</w:t>
+      </w:r>
+    </w:p>
+    <w:tbl>
+      <w:tblPr>
+        <w:tblStyle w:val="LightGrid-Accent1"/>
+        <w:tblW w:type="auto" w:w="0"/>
+        <w:tblLayout w:type="autofit"/>
+        <w:tblLook w:firstColumn="1" w:firstRow="1" w:lastColumn="0" w:lastRow="0" w:noHBand="0" w:noVBand="1" w:val="04A0"/>
+      </w:tblPr>
+      <w:tblGrid>
+        <w:gridCol w:w="2409"/>
+        <w:gridCol w:w="2409"/>
+        <w:gridCol w:w="2409"/>
+        <w:gridCol w:w="2409"/>
+      </w:tblGrid>
+      <w:tr>
+        <w:tc>
+          <w:tcPr>
+            <w:tcW w:type="dxa" w:w="2409"/>
+            <w:vAlign w:val="top"/>
+            <w:shd w:val="clear" w:color="auto" w:fill="0B4EA2"/>
+          </w:tcPr>
+          <w:p>
+            <w:r/>
+            <w:r>
+              <w:rPr>
+                <w:b/>
+                <w:color w:val="FFFFFF"/>
+                <w:sz w:val="19"/>
+              </w:rPr>
+              <w:t>Field</w:t>
+            </w:r>
+          </w:p>
+        </w:tc>
+        <w:tc>
+          <w:tcPr>
+            <w:tcW w:type="dxa" w:w="2409"/>
+            <w:vAlign w:val="top"/>
+            <w:shd w:val="clear" w:color="auto" w:fill="0B4EA2"/>
+          </w:tcPr>
+          <w:p>
+            <w:r/>
+            <w:r>
+              <w:rPr>
+                <w:b/>
+                <w:color w:val="FFFFFF"/>
+                <w:sz w:val="19"/>
+              </w:rPr>
+              <w:t>Type</w:t>
+            </w:r>
+          </w:p>
+        </w:tc>
+        <w:tc>
+          <w:tcPr>
+            <w:tcW w:type="dxa" w:w="2409"/>
+            <w:vAlign w:val="top"/>
+            <w:shd w:val="clear" w:color="auto" w:fill="0B4EA2"/>
+          </w:tcPr>
+          <w:p>
+            <w:r/>
+            <w:r>
+              <w:rPr>
+                <w:b/>
+                <w:color w:val="FFFFFF"/>
+                <w:sz w:val="19"/>
+              </w:rPr>
+              <w:t>Required</w:t>
+            </w:r>
+          </w:p>
+        </w:tc>
+        <w:tc>
+          <w:tcPr>
+            <w:tcW w:type="dxa" w:w="2409"/>
+            <w:vAlign w:val="top"/>
+            <w:shd w:val="clear" w:color="auto" w:fill="0B4EA2"/>
+          </w:tcPr>
+          <w:p>
+            <w:r/>
+            <w:r>
+              <w:rPr>
+                <w:b/>
+                <w:color w:val="FFFFFF"/>
+                <w:sz w:val="19"/>
+              </w:rPr>
+              <w:t>Description</w:t>
+            </w:r>
+          </w:p>
+        </w:tc>
+      </w:tr>
+      <w:tr>
+        <w:tc>
+          <w:tcPr>
+            <w:tcW w:type="dxa" w:w="2409"/>
+            <w:vAlign w:val="top"/>
+          </w:tcPr>
+          <w:p>
+            <w:r/>
+            <w:r>
+              <w:rPr>
+                <w:sz w:val="19"/>
+              </w:rPr>
+              <w:t>charger_id</w:t>
+            </w:r>
+          </w:p>
+        </w:tc>
+        <w:tc>
+          <w:tcPr>
+            <w:tcW w:type="dxa" w:w="2409"/>
+            <w:vAlign w:val="top"/>
+          </w:tcPr>
+          <w:p>
+            <w:r/>
+            <w:r>
+              <w:rPr>
+                <w:sz w:val="19"/>
+              </w:rPr>
+              <w:t>string</w:t>
+            </w:r>
+          </w:p>
+        </w:tc>
+        <w:tc>
+          <w:tcPr>
+            <w:tcW w:type="dxa" w:w="2409"/>
+            <w:vAlign w:val="top"/>
+          </w:tcPr>
+          <w:p>
+            <w:r/>
+            <w:r>
+              <w:rPr>
+                <w:sz w:val="19"/>
+              </w:rPr>
+              <w:t>Yes</w:t>
+            </w:r>
+          </w:p>
+        </w:tc>
+        <w:tc>
+          <w:tcPr>
+            <w:tcW w:type="dxa" w:w="2409"/>
+            <w:vAlign w:val="top"/>
+          </w:tcPr>
+          <w:p>
+            <w:r/>
+            <w:r>
+              <w:rPr>
+                <w:sz w:val="19"/>
+              </w:rPr>
+              <w:t>Physical charger ID</w:t>
+            </w:r>
+          </w:p>
+        </w:tc>
+      </w:tr>
+      <w:tr>
+        <w:tc>
+          <w:tcPr>
+            <w:tcW w:type="dxa" w:w="2409"/>
+            <w:vAlign w:val="top"/>
+            <w:shd w:val="clear" w:color="auto" w:fill="F2F5FA"/>
+          </w:tcPr>
+          <w:p>
+            <w:r/>
+            <w:r>
+              <w:rPr>
+                <w:sz w:val="19"/>
+              </w:rPr>
+              <w:t>action</w:t>
+            </w:r>
+          </w:p>
+        </w:tc>
+        <w:tc>
+          <w:tcPr>
+            <w:tcW w:type="dxa" w:w="2409"/>
+            <w:vAlign w:val="top"/>
+            <w:shd w:val="clear" w:color="auto" w:fill="F2F5FA"/>
+          </w:tcPr>
+          <w:p>
+            <w:r/>
+            <w:r>
+              <w:rPr>
+                <w:sz w:val="19"/>
+              </w:rPr>
+              <w:t>string</w:t>
+            </w:r>
+          </w:p>
+        </w:tc>
+        <w:tc>
+          <w:tcPr>
+            <w:tcW w:type="dxa" w:w="2409"/>
+            <w:vAlign w:val="top"/>
+            <w:shd w:val="clear" w:color="auto" w:fill="F2F5FA"/>
+          </w:tcPr>
+          <w:p>
+            <w:r/>
+            <w:r>
+              <w:rPr>
+                <w:sz w:val="19"/>
+              </w:rPr>
+              <w:t>Yes</w:t>
+            </w:r>
+          </w:p>
+        </w:tc>
+        <w:tc>
+          <w:tcPr>
+            <w:tcW w:type="dxa" w:w="2409"/>
+            <w:vAlign w:val="top"/>
+            <w:shd w:val="clear" w:color="auto" w:fill="F2F5FA"/>
+          </w:tcPr>
+          <w:p>
+            <w:r/>
+            <w:r>
+              <w:rPr>
+                <w:sz w:val="19"/>
+              </w:rPr>
+              <w:t>lock or unlock</w:t>
+            </w:r>
+          </w:p>
+        </w:tc>
+      </w:tr>
+      <w:tr>
+        <w:tc>
+          <w:tcPr>
+            <w:tcW w:type="dxa" w:w="2409"/>
+            <w:vAlign w:val="top"/>
+          </w:tcPr>
+          <w:p>
+            <w:r/>
+            <w:r>
+              <w:rPr>
+                <w:sz w:val="19"/>
+              </w:rPr>
+              <w:t>connector_id</w:t>
+            </w:r>
+          </w:p>
+        </w:tc>
+        <w:tc>
+          <w:tcPr>
+            <w:tcW w:type="dxa" w:w="2409"/>
+            <w:vAlign w:val="top"/>
+          </w:tcPr>
+          <w:p>
+            <w:r/>
+            <w:r>
+              <w:rPr>
+                <w:sz w:val="19"/>
+              </w:rPr>
+              <w:t>integer</w:t>
+            </w:r>
+          </w:p>
+        </w:tc>
+        <w:tc>
+          <w:tcPr>
+            <w:tcW w:type="dxa" w:w="2409"/>
+            <w:vAlign w:val="top"/>
+          </w:tcPr>
+          <w:p>
+            <w:r/>
+            <w:r>
+              <w:rPr>
+                <w:sz w:val="19"/>
+              </w:rPr>
+              <w:t>No</w:t>
+            </w:r>
+          </w:p>
+        </w:tc>
+        <w:tc>
+          <w:tcPr>
+            <w:tcW w:type="dxa" w:w="2409"/>
+            <w:vAlign w:val="top"/>
+          </w:tcPr>
+          <w:p>
+            <w:r/>
+            <w:r>
+              <w:rPr>
+                <w:sz w:val="19"/>
+              </w:rPr>
+              <w:t>0 (default) locks the whole charger; 1..N locks a specific connector</w:t>
+            </w:r>
+          </w:p>
+        </w:tc>
+      </w:tr>
+    </w:tbl>
+    <w:p/>
+    <w:p>
+      <w:r>
+        <w:rPr>
+          <w:b/>
+        </w:rPr>
+        <w:t>Example</w:t>
+      </w:r>
+    </w:p>
+    <w:p>
+      <w:pPr>
+        <w:spacing w:before="80" w:after="160"/>
+        <w:ind w:left="283"/>
+        <w:shd w:val="clear" w:color="auto" w:fill="F4F4F4"/>
+      </w:pPr>
+      <w:r>
+        <w:rPr>
+          <w:rFonts w:ascii="Consolas" w:hAnsi="Consolas"/>
+          <w:sz w:val="18"/>
+        </w:rPr>
+        <w:t>curl -X POST https://charger.czeros.tech/ocpi/2.2.1/aion/lock \</w:t>
+        <w:br/>
+        <w:t xml:space="preserve">  -H "Authorization: Token $OCPI_TOKEN" \</w:t>
+        <w:br/>
+        <w:t xml:space="preserve">  -H "Content-Type: application/json" \</w:t>
+        <w:br/>
+        <w:t xml:space="preserve">  -d '{"charger_id":"0748911403000093","action":"lock"}'</w:t>
+      </w:r>
+    </w:p>
+    <w:p>
+      <w:r>
+        <w:rPr>
+          <w:b/>
+        </w:rPr>
+        <w:t>Response 200</w:t>
+      </w:r>
+    </w:p>
+    <w:p>
+      <w:pPr>
+        <w:spacing w:before="80" w:after="160"/>
+        <w:ind w:left="283"/>
+        <w:shd w:val="clear" w:color="auto" w:fill="F4F4F4"/>
+      </w:pPr>
+      <w:r>
+        <w:rPr>
+          <w:rFonts w:ascii="Consolas" w:hAnsi="Consolas"/>
+          <w:sz w:val="18"/>
+        </w:rPr>
+        <w:t>{</w:t>
+        <w:br/>
+        <w:t xml:space="preserve">  "status_code": 1000,</w:t>
+        <w:br/>
+        <w:t xml:space="preserve">  "status_message": "Success",</w:t>
+        <w:br/>
+        <w:t xml:space="preserve">  "timestamp": "2026-07-15T03:09:38Z",</w:t>
+        <w:br/>
+        <w:t xml:space="preserve">  "data": {</w:t>
+        <w:br/>
+        <w:t xml:space="preserve">    "charger_id": "0748911403000093",</w:t>
+        <w:br/>
+        <w:t xml:space="preserve">    "connector_id": 0,</w:t>
+        <w:br/>
+        <w:t xml:space="preserve">    "action": "lock",</w:t>
+        <w:br/>
+        <w:t xml:space="preserve">    "ocpp_status": "Accepted"</w:t>
+        <w:br/>
+        <w:t xml:space="preserve">  }</w:t>
+        <w:br/>
+        <w:t>}</w:t>
+      </w:r>
+    </w:p>
+    <w:p>
+      <w:pPr>
+        <w:spacing w:before="200" w:after="120"/>
+      </w:pPr>
+      <w:r>
+        <w:rPr>
+          <w:b/>
+          <w:color w:val="1A1A1A"/>
+          <w:sz w:val="26"/>
+        </w:rPr>
+        <w:t>`GET /ocpi/2.2.1/aion/lock?charger_id={id}`</w:t>
+      </w:r>
+    </w:p>
+    <w:p>
+      <w:pPr>
+        <w:spacing w:before="80" w:after="160"/>
+        <w:ind w:left="283"/>
+        <w:shd w:val="clear" w:color="auto" w:fill="F4F4F4"/>
+      </w:pPr>
+      <w:r>
+        <w:rPr>
+          <w:rFonts w:ascii="Consolas" w:hAnsi="Consolas"/>
+          <w:sz w:val="18"/>
+        </w:rPr>
+        <w:t>{</w:t>
+        <w:br/>
+        <w:t xml:space="preserve">  "charger_id": "0748911403000093",</w:t>
+        <w:br/>
+        <w:t xml:space="preserve">  "locked": false,</w:t>
+        <w:br/>
+        <w:t xml:space="preserve">  "availability": "available"</w:t>
+        <w:br/>
+        <w:t>}</w:t>
+      </w:r>
+    </w:p>
+    <w:p>
+      <w:pPr>
+        <w:pBdr>
+          <w:bottom w:val="single" w:sz="8" w:color="0B4EA2"/>
+        </w:pBdr>
+      </w:pPr>
+    </w:p>
+    <w:p>
+      <w:pPr>
+        <w:spacing w:before="280" w:after="120"/>
+      </w:pPr>
+      <w:r>
+        <w:rPr>
+          <w:b/>
+          <w:color w:val="0B4EA2"/>
+          <w:sz w:val="44"/>
+        </w:rPr>
         <w:t>6. Integration Checklist (for Partner Onboarding)</w:t>
       </w:r>
     </w:p>
@@ -4182,7 +7031,73 @@
               <w:rPr>
                 <w:sz w:val="19"/>
               </w:rPr>
-              <w:t>Initial release covering 10 OCPI modules</w:t>
+              <w:t>Initial release covering 10 standard OCPI modules</w:t>
+            </w:r>
+          </w:p>
+        </w:tc>
+      </w:tr>
+      <w:tr>
+        <w:tc>
+          <w:tcPr>
+            <w:tcW w:type="dxa" w:w="2409"/>
+            <w:vAlign w:val="top"/>
+            <w:shd w:val="clear" w:color="auto" w:fill="F2F5FA"/>
+          </w:tcPr>
+          <w:p>
+            <w:r/>
+            <w:r>
+              <w:rPr>
+                <w:sz w:val="19"/>
+              </w:rPr>
+              <w:t>1.1</w:t>
+            </w:r>
+          </w:p>
+        </w:tc>
+        <w:tc>
+          <w:tcPr>
+            <w:tcW w:type="dxa" w:w="2409"/>
+            <w:vAlign w:val="top"/>
+            <w:shd w:val="clear" w:color="auto" w:fill="F2F5FA"/>
+          </w:tcPr>
+          <w:p>
+            <w:r/>
+            <w:r>
+              <w:rPr>
+                <w:sz w:val="19"/>
+              </w:rPr>
+              <w:t>15 July 2026</w:t>
+            </w:r>
+          </w:p>
+        </w:tc>
+        <w:tc>
+          <w:tcPr>
+            <w:tcW w:type="dxa" w:w="2409"/>
+            <w:vAlign w:val="top"/>
+            <w:shd w:val="clear" w:color="auto" w:fill="F2F5FA"/>
+          </w:tcPr>
+          <w:p>
+            <w:r/>
+            <w:r>
+              <w:rPr>
+                <w:sz w:val="19"/>
+              </w:rPr>
+              <w:t>C Zero Engineering</w:t>
+            </w:r>
+          </w:p>
+        </w:tc>
+        <w:tc>
+          <w:tcPr>
+            <w:tcW w:type="dxa" w:w="2409"/>
+            <w:vAlign w:val="top"/>
+            <w:shd w:val="clear" w:color="auto" w:fill="F2F5FA"/>
+          </w:tcPr>
+          <w:p>
+            <w:r/>
+            <w:r>
+              <w:rPr>
+                <w:sz w:val="19"/>
+              </w:rPr>
+              <w:t>Added §5.13 AION Vendor Extension — 5 new modules (lights, display, credentials, schedule, lock) under /ocpi/2.2.1/aion/* for AION E7-A firmware ≥ TK-AMC003-LCD_V2.0.04</w:t>
             </w:r>
           </w:p>
         </w:tc>
@@ -4225,21 +7140,7 @@
         <w:t>Project Lead:</w:t>
       </w:r>
       <w:r>
-        <w:t xml:space="preserve"> Aqid — aqidishak28@gmail.com</w:t>
-      </w:r>
-    </w:p>
-    <w:p>
-      <w:pPr>
-        <w:pStyle w:val="ListBullet"/>
-      </w:pPr>
-      <w:r>
-        <w:rPr>
-          <w:b/>
-        </w:rPr>
-        <w:t>Engineering:</w:t>
-      </w:r>
-      <w:r>
-        <w:t xml:space="preserve"> engineering@plagsini.com</w:t>
+        <w:t xml:space="preserve"> Aqid Ishak — aqid@c-zero.my</w:t>
       </w:r>
     </w:p>
     <w:p>

</xml_diff>